<commit_message>
minor features added v1.1
</commit_message>
<xml_diff>
--- a/Feature checklist.docx
+++ b/Feature checklist.docx
@@ -369,6 +369,54 @@
     </w:p>
     <w:p>
       <w:pPr>
+        <w:pStyle w:val="ListParagraph"/>
+        <w:numPr>
+          <w:ilvl w:val="1"/>
+          <w:numId w:val="1"/>
+        </w:numPr>
+      </w:pPr>
+      <w:r>
+        <w:t>merchant:</w:t>
+      </w:r>
+    </w:p>
+    <w:p>
+      <w:pPr>
+        <w:pStyle w:val="ListParagraph"/>
+        <w:numPr>
+          <w:ilvl w:val="2"/>
+          <w:numId w:val="1"/>
+        </w:numPr>
+      </w:pPr>
+      <w:r>
+        <w:t>should be able to access their account and view details associated (e.g. balance)</w:t>
+      </w:r>
+    </w:p>
+    <w:p>
+      <w:pPr>
+        <w:pStyle w:val="ListParagraph"/>
+        <w:numPr>
+          <w:ilvl w:val="2"/>
+          <w:numId w:val="1"/>
+        </w:numPr>
+      </w:pPr>
+      <w:r>
+        <w:t>if merchant is behind on payment, when they log in a payment reminder should be shown</w:t>
+      </w:r>
+    </w:p>
+    <w:p>
+      <w:pPr>
+        <w:pStyle w:val="ListParagraph"/>
+        <w:numPr>
+          <w:ilvl w:val="2"/>
+          <w:numId w:val="1"/>
+        </w:numPr>
+      </w:pPr>
+      <w:r>
+        <w:t>merchant should be able to see state of account</w:t>
+      </w:r>
+    </w:p>
+    <w:p>
+      <w:pPr>
         <w:rPr>
           <w:b/>
           <w:bCs/>
@@ -451,6 +499,7 @@
         </w:numPr>
       </w:pPr>
       <w:r>
+        <w:lastRenderedPageBreak/>
         <w:t>feature to search for an item using searching criteria (e.g. item ID, key term, etc) should be implemented</w:t>
       </w:r>
     </w:p>
@@ -499,7 +548,6 @@
         </w:numPr>
       </w:pPr>
       <w:r>
-        <w:lastRenderedPageBreak/>
         <w:t>feature to generate a list of all items in catalogue below their minimum stock should be implemented</w:t>
       </w:r>
     </w:p>
@@ -659,10 +707,31 @@
         </w:numPr>
       </w:pPr>
       <w:r>
-        <w:t xml:space="preserve">managers should be able to change the status of an order </w:t>
-      </w:r>
-      <w:r>
-        <w:t>(when orders are dispatched)</w:t>
+        <w:t>managers should be able to change the status of an order</w:t>
+      </w:r>
+    </w:p>
+    <w:p>
+      <w:pPr>
+        <w:pStyle w:val="ListParagraph"/>
+        <w:numPr>
+          <w:ilvl w:val="0"/>
+          <w:numId w:val="4"/>
+        </w:numPr>
+      </w:pPr>
+      <w:r>
+        <w:t>once an order is placed, an invoice should be generated for the system (this is separate from the merchant functionality)</w:t>
+      </w:r>
+    </w:p>
+    <w:p>
+      <w:pPr>
+        <w:pStyle w:val="ListParagraph"/>
+        <w:numPr>
+          <w:ilvl w:val="0"/>
+          <w:numId w:val="4"/>
+        </w:numPr>
+      </w:pPr>
+      <w:r>
+        <w:t>orders should only have 3 states: accepted, being processed, dispatched</w:t>
       </w:r>
     </w:p>
     <w:p/>

</xml_diff>